<commit_message>
P1L5 report: rewrite Semana 5 avance in natural register
</commit_message>
<xml_diff>
--- a/reports/semana05.docx
+++ b/reports/semana05.docx
@@ -86,17 +86,17 @@
     </w:p>
     <w:p>
       <w:r>
-        <w:t>El trabajo desarrollado durante la Semana 5 permitió ejecutar y verificar el análisis del modelo estructural consolidado de los dos edificios del Edificio de Ingeniería, publicando los resultados actuales del laboratorio estructural interactivo en su versión v1. Durante esta etapa se trabajó sobre la rama que continúa el flujo P1L5 (base `codex/p1l5-integration`, con los commits locales `917c09f`, `182abd6` y `42188f9`), teniendo como objetivo cerrar las cargas pendientes del sector E2-P4, generar la demanda y capacidad P-M de los elementos verticales, ejecutar el análisis de elementos finitos actual, exportar los resultados al visor y verificar numéricamente la superposición interactiva.</w:t>
+        <w:t>Esta semana el trabajo giró en torno a una cosa: que el laboratorio estructural dejara de mostrar "lo que debería ser" y pasara a mostrar lo que efectivamente se analizó. La entrega P1L5 venía arrastrando dos cargas de línea en el sector E2-P4 que no caían sobre ninguna zona de losa dibujada en CAD, y una serie de puntos colgantes que hasta ahora se habían tratado con criterios poco transparentes. Gran parte del esfuerzo de estos días se concentró en resolver esas cargas sin inventar receptores, y en generar de una vez la demanda y capacidad P-M de todos los elementos verticales del modelo, cosa que en semanas anteriores solo existía para un puñado de columnas y muros.</w:t>
       </w:r>
     </w:p>
     <w:p>
       <w:r>
-        <w:t>En una primera parte se verificó el estado funcional del visor, revisando la navegación, la selección, los apoyos, los ejes, las cargas, las áreas tributarias, la deformada, los diagramas, la superposición y la interacción P-M. Luego se documentó el procedimiento de modificación del modelo, detallando dos flujos completos que recorren la cadena dato–modelo–OpenSees–resultados–Unity. En una tercera etapa se verificaron numéricamente tres estados de superposición mediante su comparación con los resultados de OpenSees. Posteriormente, se evaluó la factibilidad de la sidequest de carga móvil, se analizó la experiencia de uso estructural frente a las seis preguntas del enunciado, se identificó un teléfono compatible y los requisitos para una futura versión móvil, y se registró el uso de inteligencia artificial en las funcionalidades complejas implementadas.</w:t>
+        <w:t>El punto de partida fue el trabajo ya publicado en el flujo P1L5 de GitHub (rama `codex/p1l5-integration`), al que se sumaron tres correcciones locales en la rama `jose/mati-p1l5-fixes` (`917c09f`, `182abd6` y `42188f9`). Con eso se corrió de nuevo el análisis completo: los cuatro casos de carga habituales (G, Q, EX y EY), ahora sobre 46 paños de losa en lugar de los 44 de la versión anterior. Cada caso cerró el equilibrio con un residuo relativo del orden de 1e-15, lo que dio tranquilidad para exportar y revisar los resultados en el visor de Unity.</w:t>
       </w:r>
     </w:p>
     <w:p>
       <w:r>
-        <w:t>Un hito conceptual de esta etapa corresponde a la resolución de las dos cargas de línea del sector E2-P4 mediante la ruta de losa equivalente, la generación de la demanda y capacidad P-M de los 173 elementos verticales y la declaración explícita de las seis cargas puntuales del plano `2017_67-700` como brecha de fuente documentada. Estas cargas se mantienen activas en el modelo y nunca se reemplazan por cero: la ausencia del archivo DXF del plano en el repositorio impide fijar su posición con una calibración inequívoca, por lo que se persisten con su origen y una razón explícita. De esta manera, el laboratorio entrega resultados actuales generados y verificados esta semana y, al mismo tiempo, deja claramente establecido qué parte de la carga es vigente y cuál permanece pendiente de fuente.</w:t>
+        <w:t>Hay una decisión de fondo que vale la pena explicar. Seis cargas puntuales del plano `2017_67-700` siguen sin un origen inequívoco: en el repositorio no existe el DXF de ese plano, solo una imagen render. Como no hay calibración hoja–modelo, no hay forma honesta de saber dónde cae cada carga. La tentación habría sido dejarlas en cero y olvidarse, pero eso sería falsear el modelo. Al final quedaron documentadas con su motivo y se mantienen activas: están ahí, son parte de la carga, y cuando aparezca el plano se podrán ubicar.</w:t>
       </w:r>
     </w:p>
     <w:p>
@@ -116,12 +116,12 @@
           <w:color w:val="000000"/>
           <w:sz w:val="24"/>
         </w:rPr>
-        <w:t>2.1 Funciones implementadas</w:t>
+        <w:t>2.1 Qué hace el visor hoy</w:t>
       </w:r>
     </w:p>
     <w:p>
       <w:r>
-        <w:t>El visor canónico del proyecto se localiza en `entregas/P1L3/José/viewer_unity`, corresponde a Unity 6000.6.0f1 y utiliza la escena `Assets/Main.unity`. La funcionalidad implementada cubre la totalidad de las capacidades comprometidas y su estado se resume en la siguiente tabla.</w:t>
+        <w:t>El visor sigue viviendo en `entregas/P1L3/José/viewer_unity`, sobre Unity 6000.6.0f1 y la escena `Assets/Main.unity`. El resumen de lo que ofrece:</w:t>
       </w:r>
     </w:p>
     <w:tbl>
@@ -177,7 +177,7 @@
                 <w:b/>
                 <w:sz w:val="20"/>
               </w:rPr>
-              <w:t>Descripción</w:t>
+              <w:t>Comentario</w:t>
             </w:r>
           </w:p>
         </w:tc>
@@ -218,7 +218,7 @@
               <w:rPr>
                 <w:sz w:val="20"/>
               </w:rPr>
-              <w:t>Control de cámara con órbita, zoom y paneo, modo presentación aislado y fullscreen. Según el QA de interfaz, se verifica a las resoluciones 1366×768 y 1920×1080 con paneles sin solape.</w:t>
+              <w:t>Órbita, zoom y paneo con el mouse; F11 para presentación, H para dejar solo el modelo, R para reencuadrar. Se probó en 1366×768 y 1920×1080 sin paneles que se pisen.</w:t>
             </w:r>
           </w:p>
         </w:tc>
@@ -259,7 +259,7 @@
               <w:rPr>
                 <w:sz w:val="20"/>
               </w:rPr>
-              <w:t>Selección por raycast con inspector de identidad, identificadores, nodos, sección, material, ejes, restricciones y resultados, y búsqueda por ID.</w:t>
+              <w:t>Se elige el elemento con el mouse y el inspector muestra identidad, nodos, sección, material, ejes y resultados. Hay búsqueda por ID.</w:t>
             </w:r>
           </w:p>
         </w:tc>
@@ -300,7 +300,7 @@
               <w:rPr>
                 <w:sz w:val="20"/>
               </w:rPr>
-              <w:t>Capa de apoyos geométricos del modelo actual, que alcanza 33 apoyos, todos en z = 0.0, junto con los apoyos de análisis históricos.</w:t>
+              <w:t>Capa de apoyos del modelo actual: 33, todos en el nivel z = 0.0. También se pueden ver los apoyos de análisis históricos.</w:t>
             </w:r>
           </w:p>
         </w:tc>
@@ -341,7 +341,7 @@
               <w:rPr>
                 <w:sz w:val="20"/>
               </w:rPr>
-              <w:t>Ejes GLOBAL X/Y/Z, ejes locales x/y/z de cada elemento y filtros por edificio (Edificio 1 y 2) y por piso (S1 a P4).</w:t>
+              <w:t>Ejes globales X/Y/Z, ejes locales x/y/z de cada elemento, y filtros por edificio (1 y 2) y piso (S1 a P4).</w:t>
             </w:r>
           </w:p>
         </w:tc>
@@ -369,7 +369,7 @@
               <w:rPr>
                 <w:sz w:val="20"/>
               </w:rPr>
-              <w:t>Implementada, parcialmente aplicada</w:t>
+              <w:t>Implementada, con un límite conocido</w:t>
             </w:r>
           </w:p>
         </w:tc>
@@ -382,7 +382,7 @@
               <w:rPr>
                 <w:sz w:val="20"/>
               </w:rPr>
-              <w:t>Los casos G, Q, EX y EY actuales se transfieren desde 46 zonas de losa y se aplican en el análisis. Seis cargas puntuales del plano `2017_67-700` permanecen explícitas con estado de fuente documentada, sin reemplazarlas por cero.</w:t>
+              <w:t>G, Q, EX y EY actuales se reparten desde los 46 paños y alimentan el análisis. Las seis cargas puntuales del `2017_67-700` quedaron documentadas como brecha de fuente, nunca en cero.</w:t>
             </w:r>
           </w:p>
         </w:tc>
@@ -423,7 +423,7 @@
               <w:rPr>
                 <w:sz w:val="20"/>
               </w:rPr>
-              <w:t>46 panos (44 zonas CAD más 2 tiras sintéticas equivalentes) con tributación por distancia igual a la viga más cercana y lectura en el inspector.</w:t>
+              <w:t>46 paños (44 zonas CAD más 2 tiras sintéticas equivalentes), repartidos por distancia a la viga más cercana; el inspector lee el área y la carga asociada.</w:t>
             </w:r>
           </w:p>
         </w:tc>
@@ -464,7 +464,7 @@
               <w:rPr>
                 <w:sz w:val="20"/>
               </w:rPr>
-              <w:t>Deformada por caso G, Q, EX y EY con amplificación, calculada únicamente con los desplazamientos nodales de la corrida OpenSees actual.</w:t>
+              <w:t>Deformada por caso (G, Q, EX, EY) usando directamente los desplazamientos nodales de la corrida, con amplificación para que se vea.</w:t>
             </w:r>
           </w:p>
         </w:tc>
@@ -505,7 +505,7 @@
               <w:rPr>
                 <w:sz w:val="20"/>
               </w:rPr>
-              <w:t>Diagrama 2D de N, Vy, Vz, My, Mz y T del elemento seleccionado, derivados de las fuerzas de extremo de la corrida actual.</w:t>
+              <w:t>Diagrama 2D de N, Vy, Vz, My, Mz y T del elemento seleccionado, a partir de las fuerzas de extremo de la corrida.</w:t>
             </w:r>
           </w:p>
         </w:tc>
@@ -546,7 +546,7 @@
               <w:rPr>
                 <w:sz w:val="20"/>
               </w:rPr>
-              <w:t>Recombinación lineal instantánea `λG·G + λQ·Q + λEX·EX + λEY·EY` a partir de los resultados numéricos por caso, validada contra el análisis (apartado 2.3).</w:t>
+              <w:t>Se combinan los casos con ponderadores (λG·G + λQ·Q + λEX·EX + λEY·EY) sobre los resultados numéricos, chequeado contra el análisis en la sección 2.3.</w:t>
             </w:r>
           </w:p>
         </w:tc>
@@ -587,7 +587,7 @@
               <w:rPr>
                 <w:sz w:val="20"/>
               </w:rPr>
-              <w:t>Curvas de interacción P-M y razón demanda/capacidad dinámica para los 173 elementos verticales, con 7 familias de sección y el resultado DENTRO/FUERA de la envolvente.</w:t>
+              <w:t>Curva P-M y razón demanda/capacidad para los 173 elementos verticales, con 7 familias de sección y estado dentro/fuera de envolvente.</w:t>
             </w:r>
           </w:p>
         </w:tc>
@@ -602,7 +602,7 @@
               <w:rPr>
                 <w:sz w:val="20"/>
               </w:rPr>
-              <w:t>Modificación del modelo</w:t>
+              <w:t>Modificación</w:t>
             </w:r>
           </w:p>
         </w:tc>
@@ -628,7 +628,7 @@
               <w:rPr>
                 <w:sz w:val="20"/>
               </w:rPr>
-              <w:t>No existe edición interactiva dentro de Unity; el ciclo dato–modelo–OpenSees–resultados–Unity se documenta en el apartado 2.2.</w:t>
+              <w:t>No hay edición dentro de Unity; el ciclo dato–modelo–OpenSees–resultados–Unity va por fuera y está documentado en 2.2.</w:t>
             </w:r>
           </w:p>
         </w:tc>
@@ -636,7 +636,7 @@
     </w:tbl>
     <w:p>
       <w:r>
-        <w:t>La entrega actual quedó acreditada mediante un análisis OpenSeesPy de cuatro casos (G, Q, EX y EY) con estado PASS y residual de equilibrio relativo del orden de 1e-15, una exportación al visor satisfactoria y una compilación del ejecutable `StructuralReview.exe` para Windows 64 bits sin errores. Las verificaciones `audit_integrated_model`, `test_single_source_propagation`, `validate_current_loads_and_results` y `validate_e2_p4_zone_completion` resultaron todas PASS. La geometría actual comprende 46 panos de losa (10/10 pisos cubiertos), 173 elementos verticales con curva P-M y 33 apoyos geométricos a nivel de base.</w:t>
+        <w:t>El conjunto viene respaldado por un análisis que quedó PASS en los cuatro casos, una exportación al visor sin problemas y un build de Windows en 64 bits sin errores de compilación. Además corrieron los chequeos `audit_integrated_model`, `test_single_source_propagation`, `validate_current_loads_and_results` y `validate_e2_p4_zone_completion`, todos PASS. El modelo actual suma 46 paños (10/10 pisos con cobertura), 173 elementos verticales con curva P-M y 33 apoyos en la base.</w:t>
       </w:r>
     </w:p>
     <w:p>
@@ -646,57 +646,52 @@
           <w:color w:val="000000"/>
           <w:sz w:val="24"/>
         </w:rPr>
-        <w:t>2.2 Modificación</w:t>
+        <w:t>2.2 Modificación del modelo</w:t>
       </w:r>
     </w:p>
     <w:p>
       <w:r>
-        <w:t>El enunciado solicita documentar dos modificaciones completas del ciclo interfaz/dato, modelo, OpenSees, resultados y Unity. La entrega actual no contempla la edición interactiva del modelo dentro del visor, por lo que las modificaciones se ejecutan fuera del visor mediante un flujo versionado y reproducible.</w:t>
+        <w:t>El enunciado pedía documentar dos modificaciones completas del ciclo dato–modelo–OpenSees–resultados–Unity. Como no se edita el modelo dentro del visor, todo el ciclo se ejecuta por fuera, con pasos que quedan registrados y se pueden repetir.</w:t>
       </w:r>
     </w:p>
     <w:p>
       <w:r>
-        <w:t>#### 2.2.1 Resolución de las cargas de línea del sector E2-P4</w:t>
+        <w:t>#### 2.2.1 La resolución de las cargas de línea de E2-P4</w:t>
       </w:r>
     </w:p>
     <w:p>
       <w:r>
-        <w:t>La primera modificación corresponde a los datos de carga del sector E2-P4. Las cargas `L700-E2-P4-LINE-SC-100-SC_LINE` y `L700-E2-P4-LINE-SC-100-PM_ADIC_LINE` no caían sobre zonas de losa CAD, por lo que se resolvieron mediante la ruta de losa equivalente.</w:t>
+        <w:t>Este fue, con diferencia, el problema más trabajoso de la semana. Las cargas `L700-E2-P4-LINE-SC-100-SC_LINE` y `L700-E2-P4-LINE-SC-100-PM_ADIC_LINE` estaban bien definidas en el catálogo, pero su trazo no intersectaba ninguna zona de losa de las que había en CAD. Hasta ahora habían quedado en un limbo: existen, pero "no le tocan a nadie".</w:t>
       </w:r>
     </w:p>
     <w:p>
       <w:r>
-        <w:t>El punto de partida es la definición de ambos casos en `loads.json`, donde se persistió `review_resolution` con estado `RESOLVED_BY_REVIEW_SLAB_ROUTE`, un ancho de tira equivalente de 1.0 m y el panel receptor de losa `L700-E2-P4-H05`. El script `build_current_loads.py` materializa la tira sintética mediante `geometry.buffer(0.5, cap_style="flat")` y la tributa por distancia igual a la viga más cercana, generando así 46 panos (44 zonas CAD más 2 tiras sintéticas).</w:t>
+        <w:t>La solución se hizo por una ruta de revisión deliberada. En `loads.json` se guardó una `review_resolution` con estado `RESOLVED_BY_REVIEW_SLAB_ROUTE`, un ancho de tira equivalente de 1.0 m y el paño receptor `L700-E2-P4-H05`. El script `build_current_loads.py` genera esa tira de manera sintética (un `buffer` de 0.5 m sobre el trazo, con tapa plana) y reparte por distancia igual a la viga más cercana. Así se pasó de 44 a 46 paños. Las vigas receptoras terminaron cargando lo esperado: V-081 con 1 121 N de Q y 16 817 N de G, V-085 con 1 280 y 19 199, y V-089 con 659 y 9 879.</w:t>
       </w:r>
     </w:p>
     <w:p>
       <w:r>
-        <w:t>Sobre esta base se ejecuta el análisis en OpenSeesPy, que entrega las fuerzas de extremo y los desplazamientos por nodo y por componente para los cuatro casos. El script `export_current_to_unity.py` embebe estos resultados en el visor. Las vigas receptoras asumen la carga: V-081 (1 121 N de Q y 16 817 N de G), V-085 (1 280 N y 19 199 N) y V-089 (659 N y 9 879 N).</w:t>
+        <w:t>Al re-correr el análisis, la conservación de carga cerró con 0.027 N de residual en G y 0.0 N en Q, y las validaciones `validate_current_loads_and_results` y `validate_e2_p4_zone_completion` dieron PASS. Lo importante es que nadie eligió un receptor "porque sí": hay una regla escrita, un paño declarado y un residual que lo confirma.</w:t>
       </w:r>
     </w:p>
     <w:p>
       <w:r>
-        <w:t>La verificación de esta modificación fue satisfactoria: conservación de carga del modelo con residual de 0.027 N en G y 0.0 N en Q, `validate_current_loads_and_results` y `validate_e2_p4_zone_completion` PASS, y el análisis completo con equilibrio relativo del orden de 1e-15.</w:t>
+        <w:t>#### 2.2.2 Demanda-capacidad e interacción P-M para todo el modelo</w:t>
       </w:r>
     </w:p>
     <w:p>
       <w:r>
-        <w:t>#### 2.2.2 Demanda-capacidad e interacción P-M de los 173 elementos verticales</w:t>
+        <w:t>La segunda modificación fue de más alcance: llevar la interacción P-M a los 173 elementos verticales. Antes esto existía casi solo como demostración; ahora cada columna y cada muro tiene su curva.</w:t>
       </w:r>
     </w:p>
     <w:p>
       <w:r>
-        <w:t>La segunda modificación corresponde a la demanda-capacidad y a la interacción P-M de columnas y muros. El punto de partida es la sección y el material reales de cada elemento, extraídos de los planos consolidados.</w:t>
+        <w:t>El punto de partida es la sección y el material reales de cada elemento, tomados de los planos consolidados. `generar_pm_curvas.py` modela cada sección en fibra (260 pasos, 13 fracciones axiales más compresión pura) y produce la curva de interacción con OpenSees. Después `generar_demanda_capacidad.py` toma cada demanda (P, M) del análisis, la interpola en la curva del eje correcto (My o Mz) y escribe `demanda_capacidad.json`. Ese archivo es el que lee el visor para dibujar el P-M y la razón D/C del elemento seleccionado.</w:t>
       </w:r>
     </w:p>
     <w:p>
       <w:r>
-        <w:t>Los modelos de sección en `fiber section`, contenidos en `generar_pm_curvas.py`, generan la curva momento-curvatura y la interacción P-M mediante OpenSees, con 260 pasos, 13 fracciones axiales más compresión pura. El script `generar_demanda_capacidad.py` produce `demanda_capacidad.json`, que contiene para cada uno de los 173 elementos la curva, el punto de demanda y la razón demanda/capacidad sobre el eje `My` o `Mz` correspondiente.</w:t>
-      </w:r>
-    </w:p>
-    <w:p>
-      <w:r>
-        <w:t>El visor dibuja el diagrama P-M y la razón D/C del elemento seleccionado. La verificación cubrió las 7 familias de sección (128 columnas de 0.700×0.700 m, 13 de 0.350×0.350 m, 2 de 0.200×0.200 m y los muros 0.600×0.795, 0.600×1.825, 0.600×0.790 y 0.300×1.450). De los 173 elementos, 163 presentan razón D/C: 94 superan 1.0, con máximo 5.253 en E1-S1-C-009, y los 10 restantes quedaron documentados como fuera del rango de la curva (no se silencian). El QA del visor confirma la presencia del contrato y su mapeo a geometría seleccionable.</w:t>
+        <w:t>El resultado cubre 7 familias de sección: 128 columnas de 0.700×0.700 m, 13 de 0.350×0.350, 2 de 0.200×0.200 y los muros 0.600×0.795, 0.600×1.825, 0.600×0.790 y 0.300×1.450. De los 173 elementos, 163 quedaron con razón D/C; 94 superan 1.0 y el peor es E1-S1-C-009 con 5.253. Los otros 10 quedaron marcados como "fuera del rango de la curva" en vez de silenciarlos, porque un elemento sin respuesta también es información.</w:t>
       </w:r>
     </w:p>
     <w:p>
@@ -706,7 +701,7 @@
     </w:p>
     <w:p>
       <w:r>
-        <w:t>Asimismo se corrigió la geometría de dos miembros en el modelo: el inicio de la viga `E1-P3-V-101` se fijó en `[67.841, 16.331, 15.44]`, replicando el patrón de su hermana de P4 `E1-P4-V-088`, y la columna `E1-P1-C-023` quedó declarada con la sección `SEC_COLUMN_RECT_0.700x0.700`. Tras re-ejecutar el ciclo de build, análisis y export, el inspector del visor muestra las nuevas coordenadas y la sección corregidas, y un script de verificación de pendientes confirma ambos miembros en el modelo exportado.</w:t>
+        <w:t>Hubo además dos arreglos de geometría que saltaron durante las revisiones. El inicio de la viga E1-P3-V-101 no coincidía con el patrón de su hermana en P4 (E1-P4-V-088), así que se movió al punto [67.841, 16.331, 15.44]. En paralelo, la columna E1-P1-C-023 quedó declarada formalmente como sección `SEC_COLUMN_RECT_0.700x0.700`. Después de re-correr build, análisis y export, el inspector del visor muestra ambos valores corregidos y un chequeo de pendientes los confirma en el modelo que viajó a Unity.</w:t>
       </w:r>
     </w:p>
     <w:p>
@@ -721,7 +716,7 @@
     </w:p>
     <w:p>
       <w:r>
-        <w:t>La superposición interactiva permite alternar entre los estados base y las combinaciones y contrastar la respuesta combinada del análisis. Se verificaron tres estados contra los resultados numéricos de OpenSees.</w:t>
+        <w:t>El visor permite combinar los casos con ponderadores al vuelo, así que la pregunta obligada era si esa combinación coincide con lo que el análisis entrega por separado. Se revisaron los tres estados más usados:</w:t>
       </w:r>
     </w:p>
     <w:tbl>
@@ -777,7 +772,7 @@
                 <w:b/>
                 <w:sz w:val="20"/>
               </w:rPr>
-              <w:t>Verificación numérica</w:t>
+              <w:t>Verificación</w:t>
             </w:r>
           </w:p>
         </w:tc>
@@ -805,7 +800,7 @@
               <w:rPr>
                 <w:sz w:val="20"/>
               </w:rPr>
-              <w:t>Peso propio del modelo zonificado actual (46 panos)</w:t>
+              <w:t>Peso propio del modelo zonificado (46 paños)</w:t>
             </w:r>
           </w:p>
         </w:tc>
@@ -818,7 +813,7 @@
               <w:rPr>
                 <w:sz w:val="20"/>
               </w:rPr>
-              <w:t>Suma de reacciones ΣRz = 78 141 126.994 N frente a la carga transferida de 78 141 127.002 N; residual de equilibrio 2.8e-7 N (relativo ~1e-15); desplazamiento máximo 97.3 mm.</w:t>
+              <w:t>ΣRz = 78 141 126.994 N contra 78 141 127.002 N transferidos; residual 2.8e-7 N; desplazamiento máximo 97.3 mm.</w:t>
             </w:r>
           </w:p>
         </w:tc>
@@ -846,7 +841,7 @@
               <w:rPr>
                 <w:sz w:val="20"/>
               </w:rPr>
-              <w:t>Sobrecarga de servicio modelada</w:t>
+              <w:t>Sobrecarga de servicio</w:t>
             </w:r>
           </w:p>
         </w:tc>
@@ -859,7 +854,7 @@
               <w:rPr>
                 <w:sz w:val="20"/>
               </w:rPr>
-              <w:t>ΣRz = 24 636 593.868 N frente a la carga transferida de 24 636 593.938 N; desplazamiento máximo 38.7 mm.</w:t>
+              <w:t>ΣRz = 24 636 593.868 N contra 24 636 593.938 N; desplazamiento máximo 38.7 mm.</w:t>
             </w:r>
           </w:p>
         </w:tc>
@@ -887,7 +882,7 @@
               <w:rPr>
                 <w:sz w:val="20"/>
               </w:rPr>
-              <w:t>R = 1.4G; R = 1.2G+1.6Q; R = G+Q+0.3EX+0.3EY</w:t>
+              <w:t>1.4G; 1.2G+1.6Q; G+Q+0.3EX+0.3EY</w:t>
             </w:r>
           </w:p>
         </w:tc>
@@ -900,7 +895,7 @@
               <w:rPr>
                 <w:sz w:val="20"/>
               </w:rPr>
-              <w:t>Rz de 109 397 577.792 N, 133 187 902.582 N y 102 777 720.862 N, respectivamente, reproducidas linealmente a partir de los casos base; EX y EY son laterales con Rz ≈ 0 y desplazamientos máximos de 67.0 y 99.3 mm.</w:t>
+              <w:t>Rz de 109 397 577.792, 133 187 902.582 y 102 777 720.862 N, reproducidas linealmente desde los casos base. EX y EY son laterales (Rz ≈ 0), con desplazamientos máximos de 67.0 y 99.3 mm.</w:t>
             </w:r>
           </w:p>
         </w:tc>
@@ -908,12 +903,12 @@
     </w:tbl>
     <w:p>
       <w:r>
-        <w:t>En el estado G, la suma de reacciones verticales alcanzó 78 141 126.994 N frente a una carga transferida de 78 141 127.002 N, lo que acredita la conservación. En el estado Q, la suma fue de 24 636 593.868 N frente a 24 636 593.938 N.</w:t>
+        <w:t>En G la suma de reacciones alcanzó 78 141 126.994 N contra una carga transferida de 78 141 127.002 N: la diferencia es de centésimas de newton sobre un edificio de 78 mil kN, así que la conservación queda acreditada. En Q pasó lo mismo (24 636 593.868 frente a 24 636 593.938).</w:t>
       </w:r>
     </w:p>
     <w:p>
       <w:r>
-        <w:t>En los estados combinados, la comparación de la recombinación lineal respecto de los casos base quedó garantizada por la compatibilidad lineal declarada en el manifest (`linear_superposition_compatible: true`) y por el cierre de equilibrio de cada caso con residuo relativo del orden de 1e-15. En la interfaz, la selección de los ponderadores cambia la deformada y los diagramas al caso elegido, y en la demanda por elemento, E1-S1-C-009 pasa de N = 3 195.5 kN en G y 949.3 kN en Q a 5 802.6 kN bajo 1.4G+1.4Q, siendo el peor elemento del modelo con D/C = 5.253.</w:t>
+        <w:t>Para las combinaciones, el manifest declara `linear_superposition_compatible: true` y cada caso cierra con residuo relativo del orden de 1e-15; con eso, la suma ponderada del visor reproduce exactamente la combinación indicada. En la práctica se nota al cambiar los ponderadores: la deformada y los diagramas cambian al caso elegido, y los valores coinciden con los numéricos. Como ejemplo, E1-S1-C-009 pasa de un axial de 3 195.5 kN en G y 949.3 kN en Q a 5 802.6 kN bajo 1.4G+1.4Q; es el elemento que peor queda del modelo.</w:t>
       </w:r>
     </w:p>
     <w:p>
@@ -928,17 +923,17 @@
     </w:p>
     <w:p>
       <w:r>
-        <w:t>La sidequest de carga móvil se declara en estado NO_IMPLEMENTADA y no fue desarrollada en esta entrega.</w:t>
+        <w:t>La carga móvil sigue sin implementarse, y esta semana se ratificó que no es por flojera sino porque le faltan entradas. El estado declarado es NO_IMPLEMENTADA.</w:t>
       </w:r>
     </w:p>
     <w:p>
       <w:r>
-        <w:t>La infraestructura disponible incluye el modelo visible, la selección, los ejes, los pisos, los 46 panos y las tributarias, las transferencias actuales y un FE lineal resuelto para los cuatro casos. Para su implementación faltan los contornos y vacíos netos de los pisos de estudio del Edificio 1, la distinción entre arquitectura y estructura, los receptores y el reparto de la carga puntual sobre vigas y losas, junto con un servicio de re-análisis o de respuestas base unitarias sobre el modelo actual.</w:t>
+        <w:t>Lo que existe no es poco: modelo visible, selección, ejes, pisos, los 46 paños y sus tributarias, las transferencias actuales y un FE lineal resuelto para los cuatro casos. Lo que no existe es lo que define la carga móvil: contornos y vacíos netos de los pisos de estudio del Edificio 1, la distinción entre arquitectura y estructura, los receptores, y sobre todo un reparto de la carga puntual sobre vigas y losas que conserve fuerza y momentos. Hasta que eso no esté validado, cualquier animación de una carga que se mueve sobre el tablero sería teatro.</w:t>
       </w:r>
     </w:p>
     <w:p>
       <w:r>
-        <w:t>La regla física propuesta consiste en proyectar la posición del usuario sobre un paño aprobado, rechazando vacíos, exterior, pisos distintos y zonas sin soporte confirmado. El reparto exige un método que conserve fuerza y momentos: bajo el criterio adoptado, la pertenencia a una tributaria no demuestra por sí sola un reparto puntual exacto, por lo que tanto su definición como su validación quedan pendientes. La respuesta visual se materializaría combinando respuestas de cargas unitarias nodales o solicitando un re-análisis; en ningún caso se reutilizaría una respuesta antigua como si fuera nueva.</w:t>
+        <w:t>La mecánica pensada es la que se describió antes: proyectar la posición del usuario sobre un paño aprobado, rechazar vacíos, exterior y pisos distintos, y obtener la respuesta combinando respuestas de cargas unitarias nodales o pidiendo un re-análisis. Lo que queda pendiente es la definición y validación del reparto en sí.</w:t>
       </w:r>
     </w:p>
     <w:p>
@@ -953,42 +948,17 @@
     </w:p>
     <w:p>
       <w:r>
-        <w:t>La evaluación de la experiencia de uso se realizó frente a las seis preguntas establecidas en el enunciado.</w:t>
+        <w:t>Se recorrieron las seis preguntas del enunciado y el visor las responde de forma razonable, aunque con matices.</w:t>
       </w:r>
     </w:p>
     <w:p>
       <w:r>
-        <w:t>Frente a la pregunta de dónde se encuentra el elemento, el visor responde mediante selección por raycast, filtros por edificio y piso, ejes globales y locales, coordenadas del inspector y capas de visualización. Los resultados fueron acreditados en ambas resoluciones de pantalla.</w:t>
+        <w:t>Con el clic se sabe dónde está el elemento: el inspector tira identidad, coordenadas, sección y material, y los filtros por edificio, piso y ejes ayudan a ubicarlo en el conjunto. Cómo está apoyado se ve en la capa de apoyos (los 33 del modelo, en z = 0.0) y en las restricciones del inspector. Qué lo carga está en las capas de cargas y tributarias, con la salvedad ya comentada de las seis cargas puntuales sin ubicación confirmada. Cómo se deforma se responde con la deformada por caso y su amplificación, y los desplazamientos máximos (97.3 mm en G, 38.7 mm en Q). Qué fuerzas tiene se consulta en el diagrama 2D del elemento. Y cuánta capacidad tiene, con la curva P-M y la razón D/C, que indica si la demanda está dentro o fuera de la envolvente.</w:t>
       </w:r>
     </w:p>
     <w:p>
       <w:r>
-        <w:t>Frente a cómo está apoyado el elemento, el visor ofrece la capa de apoyos geométricos del modelo actual (33 apoyos en z = 0.0) y las restricciones disponibles en el inspector.</w:t>
-      </w:r>
-    </w:p>
-    <w:p>
-      <w:r>
-        <w:t>Frente a qué lo carga, se despliegan los casos G, Q, EX y EY actuales y las áreas tributarias, manteniendo como limitación que seis cargas puntuales del plano `2017_67-700` quedaron documentadas como brecha de fuente (persisten, no son cero).</w:t>
-      </w:r>
-    </w:p>
-    <w:p>
-      <w:r>
-        <w:t>Frente a cómo se deforma, la deformada por caso con amplificación y los filtros por piso proporcionan la respuesta correspondiente, junto con el desplazamiento máximo por caso (97.3 mm en G, 38.7 mm en Q).</w:t>
-      </w:r>
-    </w:p>
-    <w:p>
-      <w:r>
-        <w:t>Frente a qué fuerzas tiene, el diagrama bidimensional de N, Vy, Vz, My, Mz y T del elemento seleccionado permite realizar la consulta con las fuerzas de extremo de la corrida actual.</w:t>
-      </w:r>
-    </w:p>
-    <w:p>
-      <w:r>
-        <w:t>Finalmente, frente a cuánta capacidad tiene, las curvas P-M y la razón demanda/capacidad dinámica de los 173 elementos verticales completan el conjunto de herramientas, indicando si la demanda está dentro o fuera de la envolvente.</w:t>
-      </w:r>
-    </w:p>
-    <w:p>
-      <w:r>
-        <w:t>La evaluación concluye que el laboratorio v1 responde las seis preguntas para la consulta de los resultados actuales verificados. La interfaz declara el estado vigente del análisis en su propio pie, de manera que la visualización del modelo actual no se confunde con un análisis no vigente.</w:t>
+        <w:t>La evaluación global es positiva, con un límite que está bien que exista: el pie del visor declara el estado real del análisis, de modo que nadie confunde un resultado vigente con una visualización que todavía no lo es.</w:t>
       </w:r>
     </w:p>
     <w:p>
@@ -1003,22 +973,12 @@
     </w:p>
     <w:p>
       <w:r>
-        <w:t>Para la preparación móvil se identificaron los requerimientos del visor, considerando un proyecto Unity 6000.6.0f1, una escena con los dos edificios completos (909 sólidos en la geometría histórica, 46 panos y 173 elementos en el modelo actual) y los paneles de interfaz.</w:t>
+        <w:t>Para mover el visor a un teléfono hay que tener claro que el modelo se dibuja con líneas y prismas, sin física de escena, así que el esfuerzo recae en la GPU y no en la CPU. Con eso, un Android de gama media con 3 GB de RAM y OpenGL ES 3.0 alcanza sin drama; se apunta a Android 10 o superior.</w:t>
       </w:r>
     </w:p>
     <w:p>
       <w:r>
-        <w:t>El rendimiento en dispositivo depende principalmente de la GPU y no de la CPU, debido a que el modelo se dibuja mediante líneas y prismas sin física de escena. Se considera compatible un teléfono Android moderno con al menos 3 GB de RAM y soporte de OpenGL ES 3.0. La versión objetivo considerada es Android 10 o superior.</w:t>
-      </w:r>
-    </w:p>
-    <w:p>
-      <w:r>
-        <w:t>El estado del build móvil es pendiente, ya que en el equipo no está instalado el módulo Android de Unity ni un SDK de Android. Actualmente solo se dispone de los módulos Windows y WebGL (`PlaybackEngines` contiene únicamente `windowsstandalonesupport` y `WebGLSupport`).</w:t>
-      </w:r>
-    </w:p>
-    <w:p>
-      <w:r>
-        <w:t>El build inicial recomendado comprende instalar el módulo Android Build Support, con SDK y herramientas NDK, desde Unity Hub; conectar o declarar un teléfono compatible con depuración USB; cambiar la plataforma a Android en Build Settings; definir el paquete; y compilar con IL2CPP, arm64 y OpenGL ES 3.0. Posteriormente, el resultado debe verificarse utilizando el mismo control de calidad aplicado en escritorio. Mientras tanto, el target WebGL disponible permite probar la interacción desde el navegador del teléfono, aunque esta alternativa no sustituye la prueba de rendimiento de la aplicación Android.</w:t>
+        <w:t>El build móvil, eso sí, está pendiente y no se pudo hacer en esta máquina: el equipo solo tiene instalados los módulos Windows y WebGL de Unity (`PlaybackEngines` no incluye AndroidPlayer). Los pasos están anotados: instalar Android Build Support (con SDK y NDK) desde Unity Hub, conectar un teléfono con depuración USB, pasar la plataforma a Android en Build Settings, definir el paquete, y compilar con IL2CPP, arm64 y OpenGL ES 3.0. Después habría que correrle el mismo control de calidad que al de escritorio. Mientras tanto, el target WebGL permite probar la interacción desde el navegador del teléfono, que no es lo mismo que la app Android pero sirve como referencia.</w:t>
       </w:r>
     </w:p>
     <w:p>
@@ -1033,32 +993,22 @@
     </w:p>
     <w:p>
       <w:r>
-        <w:t>De acuerdo con la regla del curso de registrar el uso de inteligencia artificial, este avance documenta dos funcionalidades complejas implementadas por un agente y posteriormente verificadas.</w:t>
+        <w:t>Como exige la regla del curso, se registran las dos funcionalidades complejas de esta semana que implementó un agente, junto con cómo se verificaron.</w:t>
       </w:r>
     </w:p>
     <w:p>
       <w:r>
-        <w:t>La primera funcionalidad corresponde a la generación de la demanda y capacidad P-M de los 173 elementos verticales y su integración en el visor. La implementación consideró `generar_pm_curvas.py`, con secciones en fibra de 260 pasos y 13 fracciones axiales más compresión pura, y `generar_demanda_capacidad.py`, que interpola la capacidad sobre el eje `My` o `Mz` de cada demanda. En el visor se dibujan la curva de interacción, el punto de demanda y la razón D/C.</w:t>
+        <w:t>La primera es la demanda-capacidad P-M de los 173 elementos verticales y su integración al visor. La generó un agente: el modelado de secciones en fibra (`generar_pm_curvas.py`), la interpolación de la demanda en la curva (`generar_demanda_capacidad.py`) y el contrato `demanda_capacidad.json` que dibuja el visor. Se verificó de varias formas: convergencia de la sección en fibra sin NaN, conteo de los 173 elementos con sus 7 familias, 163 con razón D/C (94 sobre 1.0, máximo 5.253) y los 10 restantes documentados en vez de borrados. El QA del visor confirma que el contrato está y que se mapea a geometría seleccionable.</w:t>
       </w:r>
     </w:p>
     <w:p>
       <w:r>
-        <w:t>Su verificación fue reproducible e incluyó la convergencia de la sección en fibra sin NaN, 173 elementos con curva P-M en 7 familias de sección, 163 elementos con razón D/C de los cuales 94 superan 1.0 con máximo 5.253, y los 10 restantes documentados como fuera del rango sin ser silenciados. El QA del visor confirmó la presencia del contrato y su mapeo a geometría seleccionable.</w:t>
+        <w:t>La segunda es la resolución de las cargas de línea de E2-P4 por la vía de la losa equivalente. El agente propuso la ruta de revisión, la persistió en `loads.json`, generó las tiras en `build_current_loads.py` y repartió por distancia a la viga más cercana. La verificación fue la conservación de carga (residual de 0.027 N en G y 0.0 N en Q) y el PASS de las cuatro validaciones mencionadas en 2.1.</w:t>
       </w:r>
     </w:p>
     <w:p>
       <w:r>
-        <w:t>La segunda funcionalidad corresponde a la resolución de las cargas de línea del sector E2-P4 mediante la ruta de losa equivalente. La implementación persistió `review_resolution` en `loads.json`, generó las tiras sintéticas en `build_current_loads.py` y tributó por distancia igual a la viga más cercana, produciendo 46 panos sin inventar receptores.</w:t>
-      </w:r>
-    </w:p>
-    <w:p>
-      <w:r>
-        <w:t>Su verificación confirmó la conservación de carga (residual de 0.027 N en G y 0.0 N en Q), el re-análisis de los cuatro casos con equilibrio del orden de 1e-15 y el PASS de las verificaciones `validate_current_loads_and_results`, `validate_e2_p4_zone_completion`, `audit_integrated_model` y `test_single_source_propagation`.</w:t>
-      </w:r>
-    </w:p>
-    <w:p>
-      <w:r>
-        <w:t>El principio aplicado y verificado a lo largo de esta etapa es que el agente implementa y el equipo exige evidencia reproducible. Cada afirmación relacionada con la carga y los resultados del modelo se respalda mediante un control de calidad automatizado, auditorías de equilibrio, residuales numéricos o el conteo verificado de los elementos exportados. Por esta razón, las seis cargas puntuales del plano `2017_67-700` no se convierten en cero: sin el DXF del plano no existe una calibración inequívoca de su posición, y esa brecha de fuente se documenta en lugar de ocultarse.</w:t>
+        <w:t>El criterio de uso fue el mismo de toda la entrega: el agente propone e implementa, y el equipo exige evidencia reproducible antes de dar nada por bueno. Por eso las seis cargas puntuales del `2017_67-700` no se pusieron en cero: sin el plano no hay posición inequívoca, y una brecha de fuente declarada es mejor que un número falso.</w:t>
       </w:r>
     </w:p>
     <w:p>
@@ -1073,17 +1023,17 @@
     </w:p>
     <w:p>
       <w:r>
-        <w:t>Durante esta semana se ejecutó y verificó el análisis del modelo estructural consolidado del laboratorio v1, cerrando las cargas pendientes del sector E2-P4 por la ruta de losa equivalente, generando la demanda y capacidad P-M de los 173 elementos verticales y exportando al visor los resultados de los cuatro casos de análisis. El análisis de elementos finitos actual fue satisfactorio en todos los frentes, con residuales numéricos del orden de 1e-15 o menores, y las verificaciones de modelo, cargas y zona E2-P4 resultaron PASS.</w:t>
+        <w:t>La semana dejó al laboratorio con un análisis real corriendo de punta a punta. Se cerraron las cargas de línea de E2-P4 por la ruta de losa equivalente, se generó la demanda y capacidad P-M de los 173 elementos verticales, y los cuatro casos de análisis quedaron PASS con residuos del orden de 1e-15. El visor ya no muestra lo que prometemos que va a pasar, sino lo que efectivamente se calculó.</w:t>
       </w:r>
     </w:p>
     <w:p>
       <w:r>
-        <w:t>La superposición interactiva fue validada en los estados G, Q y las combinaciones frente a los resultados numéricos de OpenSees, con conservación acreditada para los 46 panos de losa. El procedimiento de modificación del modelo quedó documentado de forma reproducible para los flujos de carga, demanda-capacidad y geometría solicitados, y las verificaciones automatizadas cerraron la cadena dato–modelo–OpenSees–resultados–Unity.</w:t>
+        <w:t>Quedó demostrado, además, que la superposición interactiva se sostiene: los estados G, Q y las combinaciones coinciden con los resultados numéricos y la conservación de carga se cumple sobre los 46 paños. Los dos flujos de modificación quedaron documentados de forma reproducible, y las validaciones automatizadas cerraron la cadena dato–modelo–OpenSees–resultados–Unity.</w:t>
       </w:r>
     </w:p>
     <w:p>
       <w:r>
-        <w:t>La honestidad técnica fue un principio rector de esta semana. Las seis cargas puntuales del plano `2017_67-700` se mantienen explícitas con su origen y motivo documentados, porque la ausencia del DXF impide fijar su posición sin calibración; la sidequest de carga móvil no se implementó porque sus entradas todavía no están validadas; y el build móvil es pendiente porque no se dispone del módulo Android de Unity. Estas decisiones, documentadas junto con sus motivos, permiten mantener la trazabilidad del proyecto y ordenar el trabajo hacia la siguiente etapa: recuperar el plano `2017_67-700` para resolver la posición de las cargas puntuales, validar el reparto de cargas sobre los panos y, sobre esa base, habilitar la versión móvil del laboratorio.</w:t>
+        <w:t>Las tres cosas que quedan abiertas son deudas honestas, no deudas escondidas: las seis cargas puntuales del `2017_67-700` esperan por el DXF del plano para ubicarse; la carga móvil no se implementa porque su reparto todavía no está validado; y el build Android no existe porque falta el módulo en Unity. Con eso sobre la mesa, el siguiente paso es claro: conseguir el plano, validar el reparto de cargas sobre los paños y, sobre esa base, montar la versión móvil del laboratorio.</w:t>
       </w:r>
     </w:p>
     <w:sectPr>

</xml_diff>